<commit_message>
resume: update Dura Digital with Central 1 Azure AI Foundry architectural guidance
</commit_message>
<xml_diff>
--- a/resume/resume-aie.docx
+++ b/resume/resume-aie.docx
@@ -376,7 +376,7 @@
         <w:pStyle w:val="BodyText"/>
       </w:pPr>
       <w:r>
-        <w:t xml:space="preserve">As Senior AI Solutions Consultant, I architected and delivered AI solutions for workflow automation in healthcare. I provided technical leadership on complex AI projects, helping organizations adopt generative AI and intelligent automation for greater operational efficiency. Solutions were designed to be secure, scalable, and compliant with healthcare regulations, enabling streamlined processes and unlocking new productivity benefits. Dura Digital is a global IT consulting and services firm dedicated to delivering business, data, and AI-driven growth solutions.</w:t>
+        <w:t xml:space="preserve">As Senior AI Solutions Consultant, I led architectural guidance for enterprise Azure AI deployments. I designed a compliant Azure AI Foundry architecture for Central 1 Credit Union (BC, Canada) — a regulated financial institution — encompassing multi-region deployment (Canada Central and Canada East) for data sovereignty under PIPEDA and BCFSA regulations, zero-trust security, private networking, MuleSoft Flex Gateway for Claude model routing, and compliance-grade observability with immutable audit logging. I evaluated model availability, identified architectural gaps, and provided effort estimates across a 13-task implementation roadmap. Dura Digital is a global IT consulting and services firm dedicated to delivering business, data, and AI-driven growth solutions.</w:t>
       </w:r>
     </w:p>
     <w:bookmarkEnd w:id="17"/>
@@ -2483,6 +2483,232 @@
     <w:basedOn w:val="VerbatimChar"/>
     <w:rPr/>
   </w:style>
+  <w:style w:customStyle="1" w:styleId="KeywordTok" w:type="character">
+    <w:name w:val="KeywordTok"/>
+    <w:basedOn w:val="VerbatimChar"/>
+    <w:rPr>
+      <w:b/>
+      <w:color w:val="007020"/>
+    </w:rPr>
+  </w:style>
+  <w:style w:customStyle="1" w:styleId="DataTypeTok" w:type="character">
+    <w:name w:val="DataTypeTok"/>
+    <w:basedOn w:val="VerbatimChar"/>
+    <w:rPr>
+      <w:color w:val="902000"/>
+    </w:rPr>
+  </w:style>
+  <w:style w:customStyle="1" w:styleId="DecValTok" w:type="character">
+    <w:name w:val="DecValTok"/>
+    <w:basedOn w:val="VerbatimChar"/>
+    <w:rPr>
+      <w:color w:val="40a070"/>
+    </w:rPr>
+  </w:style>
+  <w:style w:customStyle="1" w:styleId="BaseNTok" w:type="character">
+    <w:name w:val="BaseNTok"/>
+    <w:basedOn w:val="VerbatimChar"/>
+    <w:rPr>
+      <w:color w:val="40a070"/>
+    </w:rPr>
+  </w:style>
+  <w:style w:customStyle="1" w:styleId="FloatTok" w:type="character">
+    <w:name w:val="FloatTok"/>
+    <w:basedOn w:val="VerbatimChar"/>
+    <w:rPr>
+      <w:color w:val="40a070"/>
+    </w:rPr>
+  </w:style>
+  <w:style w:customStyle="1" w:styleId="ConstantTok" w:type="character">
+    <w:name w:val="ConstantTok"/>
+    <w:basedOn w:val="VerbatimChar"/>
+    <w:rPr>
+      <w:color w:val="880000"/>
+    </w:rPr>
+  </w:style>
+  <w:style w:customStyle="1" w:styleId="CharTok" w:type="character">
+    <w:name w:val="CharTok"/>
+    <w:basedOn w:val="VerbatimChar"/>
+    <w:rPr>
+      <w:color w:val="4070a0"/>
+    </w:rPr>
+  </w:style>
+  <w:style w:customStyle="1" w:styleId="SpecialCharTok" w:type="character">
+    <w:name w:val="SpecialCharTok"/>
+    <w:basedOn w:val="VerbatimChar"/>
+    <w:rPr>
+      <w:color w:val="4070a0"/>
+    </w:rPr>
+  </w:style>
+  <w:style w:customStyle="1" w:styleId="StringTok" w:type="character">
+    <w:name w:val="StringTok"/>
+    <w:basedOn w:val="VerbatimChar"/>
+    <w:rPr>
+      <w:color w:val="4070a0"/>
+    </w:rPr>
+  </w:style>
+  <w:style w:customStyle="1" w:styleId="VerbatimStringTok" w:type="character">
+    <w:name w:val="VerbatimStringTok"/>
+    <w:basedOn w:val="VerbatimChar"/>
+    <w:rPr>
+      <w:color w:val="4070a0"/>
+    </w:rPr>
+  </w:style>
+  <w:style w:customStyle="1" w:styleId="SpecialStringTok" w:type="character">
+    <w:name w:val="SpecialStringTok"/>
+    <w:basedOn w:val="VerbatimChar"/>
+    <w:rPr>
+      <w:color w:val="bb6688"/>
+    </w:rPr>
+  </w:style>
+  <w:style w:customStyle="1" w:styleId="ImportTok" w:type="character">
+    <w:name w:val="ImportTok"/>
+    <w:basedOn w:val="VerbatimChar"/>
+    <w:rPr>
+      <w:b/>
+      <w:color w:val="008000"/>
+    </w:rPr>
+  </w:style>
+  <w:style w:customStyle="1" w:styleId="CommentTok" w:type="character">
+    <w:name w:val="CommentTok"/>
+    <w:basedOn w:val="VerbatimChar"/>
+    <w:rPr>
+      <w:i/>
+      <w:color w:val="60a0b0"/>
+    </w:rPr>
+  </w:style>
+  <w:style w:customStyle="1" w:styleId="DocumentationTok" w:type="character">
+    <w:name w:val="DocumentationTok"/>
+    <w:basedOn w:val="VerbatimChar"/>
+    <w:rPr>
+      <w:i/>
+      <w:color w:val="ba2121"/>
+    </w:rPr>
+  </w:style>
+  <w:style w:customStyle="1" w:styleId="AnnotationTok" w:type="character">
+    <w:name w:val="AnnotationTok"/>
+    <w:basedOn w:val="VerbatimChar"/>
+    <w:rPr>
+      <w:b/>
+      <w:i/>
+      <w:color w:val="60a0b0"/>
+    </w:rPr>
+  </w:style>
+  <w:style w:customStyle="1" w:styleId="CommentVarTok" w:type="character">
+    <w:name w:val="CommentVarTok"/>
+    <w:basedOn w:val="VerbatimChar"/>
+    <w:rPr>
+      <w:b/>
+      <w:i/>
+      <w:color w:val="60a0b0"/>
+    </w:rPr>
+  </w:style>
+  <w:style w:customStyle="1" w:styleId="OtherTok" w:type="character">
+    <w:name w:val="OtherTok"/>
+    <w:basedOn w:val="VerbatimChar"/>
+    <w:rPr>
+      <w:color w:val="007020"/>
+    </w:rPr>
+  </w:style>
+  <w:style w:customStyle="1" w:styleId="FunctionTok" w:type="character">
+    <w:name w:val="FunctionTok"/>
+    <w:basedOn w:val="VerbatimChar"/>
+    <w:rPr>
+      <w:color w:val="06287e"/>
+    </w:rPr>
+  </w:style>
+  <w:style w:customStyle="1" w:styleId="VariableTok" w:type="character">
+    <w:name w:val="VariableTok"/>
+    <w:basedOn w:val="VerbatimChar"/>
+    <w:rPr>
+      <w:color w:val="19177c"/>
+    </w:rPr>
+  </w:style>
+  <w:style w:customStyle="1" w:styleId="ControlFlowTok" w:type="character">
+    <w:name w:val="ControlFlowTok"/>
+    <w:basedOn w:val="VerbatimChar"/>
+    <w:rPr>
+      <w:b/>
+      <w:color w:val="007020"/>
+    </w:rPr>
+  </w:style>
+  <w:style w:customStyle="1" w:styleId="OperatorTok" w:type="character">
+    <w:name w:val="OperatorTok"/>
+    <w:basedOn w:val="VerbatimChar"/>
+    <w:rPr>
+      <w:color w:val="666666"/>
+    </w:rPr>
+  </w:style>
+  <w:style w:customStyle="1" w:styleId="BuiltInTok" w:type="character">
+    <w:name w:val="BuiltInTok"/>
+    <w:basedOn w:val="VerbatimChar"/>
+    <w:rPr>
+      <w:color w:val="008000"/>
+    </w:rPr>
+  </w:style>
+  <w:style w:customStyle="1" w:styleId="ExtensionTok" w:type="character">
+    <w:name w:val="ExtensionTok"/>
+    <w:basedOn w:val="VerbatimChar"/>
+    <w:rPr/>
+  </w:style>
+  <w:style w:customStyle="1" w:styleId="PreprocessorTok" w:type="character">
+    <w:name w:val="PreprocessorTok"/>
+    <w:basedOn w:val="VerbatimChar"/>
+    <w:rPr>
+      <w:color w:val="bc7a00"/>
+    </w:rPr>
+  </w:style>
+  <w:style w:customStyle="1" w:styleId="AttributeTok" w:type="character">
+    <w:name w:val="AttributeTok"/>
+    <w:basedOn w:val="VerbatimChar"/>
+    <w:rPr>
+      <w:color w:val="7d9029"/>
+    </w:rPr>
+  </w:style>
+  <w:style w:customStyle="1" w:styleId="RegionMarkerTok" w:type="character">
+    <w:name w:val="RegionMarkerTok"/>
+    <w:basedOn w:val="VerbatimChar"/>
+    <w:rPr/>
+  </w:style>
+  <w:style w:customStyle="1" w:styleId="InformationTok" w:type="character">
+    <w:name w:val="InformationTok"/>
+    <w:basedOn w:val="VerbatimChar"/>
+    <w:rPr>
+      <w:b/>
+      <w:i/>
+      <w:color w:val="60a0b0"/>
+    </w:rPr>
+  </w:style>
+  <w:style w:customStyle="1" w:styleId="WarningTok" w:type="character">
+    <w:name w:val="WarningTok"/>
+    <w:basedOn w:val="VerbatimChar"/>
+    <w:rPr>
+      <w:b/>
+      <w:i/>
+      <w:color w:val="60a0b0"/>
+    </w:rPr>
+  </w:style>
+  <w:style w:customStyle="1" w:styleId="AlertTok" w:type="character">
+    <w:name w:val="AlertTok"/>
+    <w:basedOn w:val="VerbatimChar"/>
+    <w:rPr>
+      <w:b/>
+      <w:color w:val="ff0000"/>
+    </w:rPr>
+  </w:style>
+  <w:style w:customStyle="1" w:styleId="ErrorTok" w:type="character">
+    <w:name w:val="ErrorTok"/>
+    <w:basedOn w:val="VerbatimChar"/>
+    <w:rPr>
+      <w:b/>
+      <w:color w:val="ff0000"/>
+    </w:rPr>
+  </w:style>
+  <w:style w:customStyle="1" w:styleId="NormalTok" w:type="character">
+    <w:name w:val="NormalTok"/>
+    <w:basedOn w:val="VerbatimChar"/>
+    <w:rPr/>
+  </w:style>
   <w:style w:type="character" w:customStyle="1" w:styleId="KeywordTok">
     <w:name w:val="KeywordTok"/>
     <w:basedOn w:val="VerbatimChar"/>

</xml_diff>

<commit_message>
resume: remove explicit client name from Dura Digital section
</commit_message>
<xml_diff>
--- a/resume/resume-aie.docx
+++ b/resume/resume-aie.docx
@@ -376,7 +376,7 @@
         <w:pStyle w:val="BodyText"/>
       </w:pPr>
       <w:r>
-        <w:t xml:space="preserve">As Senior AI Solutions Consultant, I led architectural guidance for enterprise Azure AI deployments. I designed a compliant Azure AI Foundry architecture for Central 1 Credit Union (BC, Canada) — a regulated financial institution — encompassing multi-region deployment (Canada Central and Canada East) for data sovereignty under PIPEDA and BCFSA regulations, zero-trust security, private networking, MuleSoft Flex Gateway for Claude model routing, and compliance-grade observability with immutable audit logging. I evaluated model availability, identified architectural gaps, and provided effort estimates across a 13-task implementation roadmap. Dura Digital is a global IT consulting and services firm dedicated to delivering business, data, and AI-driven growth solutions.</w:t>
+        <w:t xml:space="preserve">As Senior AI Solutions Consultant, I led architectural guidance for enterprise Azure AI deployments. I designed a compliant Azure AI Foundry architecture for a regulated Canadian financial institution, encompassing multi-region deployment (Canada Central and Canada East) for data sovereignty under PIPEDA and BCFSA regulations, zero-trust security, private networking, MuleSoft Flex Gateway for Claude model routing, and compliance-grade observability with immutable audit logging. I evaluated model availability, identified architectural gaps, and provided effort estimates across a 13-task implementation roadmap. Dura Digital is a global IT consulting and services firm dedicated to delivering business, data, and AI-driven growth solutions.</w:t>
       </w:r>
     </w:p>
     <w:bookmarkEnd w:id="17"/>
@@ -2709,6 +2709,232 @@
     <w:basedOn w:val="VerbatimChar"/>
     <w:rPr/>
   </w:style>
+  <w:style w:customStyle="1" w:styleId="KeywordTok" w:type="character">
+    <w:name w:val="KeywordTok"/>
+    <w:basedOn w:val="VerbatimChar"/>
+    <w:rPr>
+      <w:b/>
+      <w:color w:val="007020"/>
+    </w:rPr>
+  </w:style>
+  <w:style w:customStyle="1" w:styleId="DataTypeTok" w:type="character">
+    <w:name w:val="DataTypeTok"/>
+    <w:basedOn w:val="VerbatimChar"/>
+    <w:rPr>
+      <w:color w:val="902000"/>
+    </w:rPr>
+  </w:style>
+  <w:style w:customStyle="1" w:styleId="DecValTok" w:type="character">
+    <w:name w:val="DecValTok"/>
+    <w:basedOn w:val="VerbatimChar"/>
+    <w:rPr>
+      <w:color w:val="40a070"/>
+    </w:rPr>
+  </w:style>
+  <w:style w:customStyle="1" w:styleId="BaseNTok" w:type="character">
+    <w:name w:val="BaseNTok"/>
+    <w:basedOn w:val="VerbatimChar"/>
+    <w:rPr>
+      <w:color w:val="40a070"/>
+    </w:rPr>
+  </w:style>
+  <w:style w:customStyle="1" w:styleId="FloatTok" w:type="character">
+    <w:name w:val="FloatTok"/>
+    <w:basedOn w:val="VerbatimChar"/>
+    <w:rPr>
+      <w:color w:val="40a070"/>
+    </w:rPr>
+  </w:style>
+  <w:style w:customStyle="1" w:styleId="ConstantTok" w:type="character">
+    <w:name w:val="ConstantTok"/>
+    <w:basedOn w:val="VerbatimChar"/>
+    <w:rPr>
+      <w:color w:val="880000"/>
+    </w:rPr>
+  </w:style>
+  <w:style w:customStyle="1" w:styleId="CharTok" w:type="character">
+    <w:name w:val="CharTok"/>
+    <w:basedOn w:val="VerbatimChar"/>
+    <w:rPr>
+      <w:color w:val="4070a0"/>
+    </w:rPr>
+  </w:style>
+  <w:style w:customStyle="1" w:styleId="SpecialCharTok" w:type="character">
+    <w:name w:val="SpecialCharTok"/>
+    <w:basedOn w:val="VerbatimChar"/>
+    <w:rPr>
+      <w:color w:val="4070a0"/>
+    </w:rPr>
+  </w:style>
+  <w:style w:customStyle="1" w:styleId="StringTok" w:type="character">
+    <w:name w:val="StringTok"/>
+    <w:basedOn w:val="VerbatimChar"/>
+    <w:rPr>
+      <w:color w:val="4070a0"/>
+    </w:rPr>
+  </w:style>
+  <w:style w:customStyle="1" w:styleId="VerbatimStringTok" w:type="character">
+    <w:name w:val="VerbatimStringTok"/>
+    <w:basedOn w:val="VerbatimChar"/>
+    <w:rPr>
+      <w:color w:val="4070a0"/>
+    </w:rPr>
+  </w:style>
+  <w:style w:customStyle="1" w:styleId="SpecialStringTok" w:type="character">
+    <w:name w:val="SpecialStringTok"/>
+    <w:basedOn w:val="VerbatimChar"/>
+    <w:rPr>
+      <w:color w:val="bb6688"/>
+    </w:rPr>
+  </w:style>
+  <w:style w:customStyle="1" w:styleId="ImportTok" w:type="character">
+    <w:name w:val="ImportTok"/>
+    <w:basedOn w:val="VerbatimChar"/>
+    <w:rPr>
+      <w:b/>
+      <w:color w:val="008000"/>
+    </w:rPr>
+  </w:style>
+  <w:style w:customStyle="1" w:styleId="CommentTok" w:type="character">
+    <w:name w:val="CommentTok"/>
+    <w:basedOn w:val="VerbatimChar"/>
+    <w:rPr>
+      <w:i/>
+      <w:color w:val="60a0b0"/>
+    </w:rPr>
+  </w:style>
+  <w:style w:customStyle="1" w:styleId="DocumentationTok" w:type="character">
+    <w:name w:val="DocumentationTok"/>
+    <w:basedOn w:val="VerbatimChar"/>
+    <w:rPr>
+      <w:i/>
+      <w:color w:val="ba2121"/>
+    </w:rPr>
+  </w:style>
+  <w:style w:customStyle="1" w:styleId="AnnotationTok" w:type="character">
+    <w:name w:val="AnnotationTok"/>
+    <w:basedOn w:val="VerbatimChar"/>
+    <w:rPr>
+      <w:b/>
+      <w:i/>
+      <w:color w:val="60a0b0"/>
+    </w:rPr>
+  </w:style>
+  <w:style w:customStyle="1" w:styleId="CommentVarTok" w:type="character">
+    <w:name w:val="CommentVarTok"/>
+    <w:basedOn w:val="VerbatimChar"/>
+    <w:rPr>
+      <w:b/>
+      <w:i/>
+      <w:color w:val="60a0b0"/>
+    </w:rPr>
+  </w:style>
+  <w:style w:customStyle="1" w:styleId="OtherTok" w:type="character">
+    <w:name w:val="OtherTok"/>
+    <w:basedOn w:val="VerbatimChar"/>
+    <w:rPr>
+      <w:color w:val="007020"/>
+    </w:rPr>
+  </w:style>
+  <w:style w:customStyle="1" w:styleId="FunctionTok" w:type="character">
+    <w:name w:val="FunctionTok"/>
+    <w:basedOn w:val="VerbatimChar"/>
+    <w:rPr>
+      <w:color w:val="06287e"/>
+    </w:rPr>
+  </w:style>
+  <w:style w:customStyle="1" w:styleId="VariableTok" w:type="character">
+    <w:name w:val="VariableTok"/>
+    <w:basedOn w:val="VerbatimChar"/>
+    <w:rPr>
+      <w:color w:val="19177c"/>
+    </w:rPr>
+  </w:style>
+  <w:style w:customStyle="1" w:styleId="ControlFlowTok" w:type="character">
+    <w:name w:val="ControlFlowTok"/>
+    <w:basedOn w:val="VerbatimChar"/>
+    <w:rPr>
+      <w:b/>
+      <w:color w:val="007020"/>
+    </w:rPr>
+  </w:style>
+  <w:style w:customStyle="1" w:styleId="OperatorTok" w:type="character">
+    <w:name w:val="OperatorTok"/>
+    <w:basedOn w:val="VerbatimChar"/>
+    <w:rPr>
+      <w:color w:val="666666"/>
+    </w:rPr>
+  </w:style>
+  <w:style w:customStyle="1" w:styleId="BuiltInTok" w:type="character">
+    <w:name w:val="BuiltInTok"/>
+    <w:basedOn w:val="VerbatimChar"/>
+    <w:rPr>
+      <w:color w:val="008000"/>
+    </w:rPr>
+  </w:style>
+  <w:style w:customStyle="1" w:styleId="ExtensionTok" w:type="character">
+    <w:name w:val="ExtensionTok"/>
+    <w:basedOn w:val="VerbatimChar"/>
+    <w:rPr/>
+  </w:style>
+  <w:style w:customStyle="1" w:styleId="PreprocessorTok" w:type="character">
+    <w:name w:val="PreprocessorTok"/>
+    <w:basedOn w:val="VerbatimChar"/>
+    <w:rPr>
+      <w:color w:val="bc7a00"/>
+    </w:rPr>
+  </w:style>
+  <w:style w:customStyle="1" w:styleId="AttributeTok" w:type="character">
+    <w:name w:val="AttributeTok"/>
+    <w:basedOn w:val="VerbatimChar"/>
+    <w:rPr>
+      <w:color w:val="7d9029"/>
+    </w:rPr>
+  </w:style>
+  <w:style w:customStyle="1" w:styleId="RegionMarkerTok" w:type="character">
+    <w:name w:val="RegionMarkerTok"/>
+    <w:basedOn w:val="VerbatimChar"/>
+    <w:rPr/>
+  </w:style>
+  <w:style w:customStyle="1" w:styleId="InformationTok" w:type="character">
+    <w:name w:val="InformationTok"/>
+    <w:basedOn w:val="VerbatimChar"/>
+    <w:rPr>
+      <w:b/>
+      <w:i/>
+      <w:color w:val="60a0b0"/>
+    </w:rPr>
+  </w:style>
+  <w:style w:customStyle="1" w:styleId="WarningTok" w:type="character">
+    <w:name w:val="WarningTok"/>
+    <w:basedOn w:val="VerbatimChar"/>
+    <w:rPr>
+      <w:b/>
+      <w:i/>
+      <w:color w:val="60a0b0"/>
+    </w:rPr>
+  </w:style>
+  <w:style w:customStyle="1" w:styleId="AlertTok" w:type="character">
+    <w:name w:val="AlertTok"/>
+    <w:basedOn w:val="VerbatimChar"/>
+    <w:rPr>
+      <w:b/>
+      <w:color w:val="ff0000"/>
+    </w:rPr>
+  </w:style>
+  <w:style w:customStyle="1" w:styleId="ErrorTok" w:type="character">
+    <w:name w:val="ErrorTok"/>
+    <w:basedOn w:val="VerbatimChar"/>
+    <w:rPr>
+      <w:b/>
+      <w:color w:val="ff0000"/>
+    </w:rPr>
+  </w:style>
+  <w:style w:customStyle="1" w:styleId="NormalTok" w:type="character">
+    <w:name w:val="NormalTok"/>
+    <w:basedOn w:val="VerbatimChar"/>
+    <w:rPr/>
+  </w:style>
   <w:style w:type="character" w:customStyle="1" w:styleId="KeywordTok">
     <w:name w:val="KeywordTok"/>
     <w:basedOn w:val="VerbatimChar"/>

</xml_diff>

<commit_message>
resume: strengthen Gates Foundation section with AI/data focus
</commit_message>
<xml_diff>
--- a/resume/resume-aie.docx
+++ b/resume/resume-aie.docx
@@ -334,7 +334,7 @@
         <w:pStyle w:val="BodyText"/>
       </w:pPr>
       <w:r>
-        <w:t xml:space="preserve">At the Institute for Disease Modeling (IDM), I lead the prototyping and delivery of AI-driven solutions for direct adoption by global health researchers and partner institutions in LMICs. I architect AI pipelines that transform complex epidemiology and simulation data into interactive visualizations and decision-support tools. I identify gaps within research data and processes, drive interdisciplinary collaborations with domain experts, and evaluate and recommend emerging AI technologies to maximize the Foundation’s impact in Global Health.</w:t>
+        <w:t xml:space="preserve">At the Institute for Disease Modeling (IDM), I design, build, and deploy AI and data systems that accelerate global health research. I architect end-to-end AI pipelines—from raw epidemiology and simulation data to interactive visualizations and decision-support tools—used by researchers and stakeholders to drive data-informed decisions in infectious disease eradication. I lead rapid prototyping and production delivery of AI solutions adopted by partner institutions and LMICs, identify gaps in research data infrastructure, and evaluate and recommend emerging AI technologies to maximize the Foundation’s impact in Global Health.</w:t>
       </w:r>
     </w:p>
     <w:bookmarkEnd w:id="16"/>
@@ -2935,6 +2935,232 @@
     <w:basedOn w:val="VerbatimChar"/>
     <w:rPr/>
   </w:style>
+  <w:style w:customStyle="1" w:styleId="KeywordTok" w:type="character">
+    <w:name w:val="KeywordTok"/>
+    <w:basedOn w:val="VerbatimChar"/>
+    <w:rPr>
+      <w:b/>
+      <w:color w:val="007020"/>
+    </w:rPr>
+  </w:style>
+  <w:style w:customStyle="1" w:styleId="DataTypeTok" w:type="character">
+    <w:name w:val="DataTypeTok"/>
+    <w:basedOn w:val="VerbatimChar"/>
+    <w:rPr>
+      <w:color w:val="902000"/>
+    </w:rPr>
+  </w:style>
+  <w:style w:customStyle="1" w:styleId="DecValTok" w:type="character">
+    <w:name w:val="DecValTok"/>
+    <w:basedOn w:val="VerbatimChar"/>
+    <w:rPr>
+      <w:color w:val="40a070"/>
+    </w:rPr>
+  </w:style>
+  <w:style w:customStyle="1" w:styleId="BaseNTok" w:type="character">
+    <w:name w:val="BaseNTok"/>
+    <w:basedOn w:val="VerbatimChar"/>
+    <w:rPr>
+      <w:color w:val="40a070"/>
+    </w:rPr>
+  </w:style>
+  <w:style w:customStyle="1" w:styleId="FloatTok" w:type="character">
+    <w:name w:val="FloatTok"/>
+    <w:basedOn w:val="VerbatimChar"/>
+    <w:rPr>
+      <w:color w:val="40a070"/>
+    </w:rPr>
+  </w:style>
+  <w:style w:customStyle="1" w:styleId="ConstantTok" w:type="character">
+    <w:name w:val="ConstantTok"/>
+    <w:basedOn w:val="VerbatimChar"/>
+    <w:rPr>
+      <w:color w:val="880000"/>
+    </w:rPr>
+  </w:style>
+  <w:style w:customStyle="1" w:styleId="CharTok" w:type="character">
+    <w:name w:val="CharTok"/>
+    <w:basedOn w:val="VerbatimChar"/>
+    <w:rPr>
+      <w:color w:val="4070a0"/>
+    </w:rPr>
+  </w:style>
+  <w:style w:customStyle="1" w:styleId="SpecialCharTok" w:type="character">
+    <w:name w:val="SpecialCharTok"/>
+    <w:basedOn w:val="VerbatimChar"/>
+    <w:rPr>
+      <w:color w:val="4070a0"/>
+    </w:rPr>
+  </w:style>
+  <w:style w:customStyle="1" w:styleId="StringTok" w:type="character">
+    <w:name w:val="StringTok"/>
+    <w:basedOn w:val="VerbatimChar"/>
+    <w:rPr>
+      <w:color w:val="4070a0"/>
+    </w:rPr>
+  </w:style>
+  <w:style w:customStyle="1" w:styleId="VerbatimStringTok" w:type="character">
+    <w:name w:val="VerbatimStringTok"/>
+    <w:basedOn w:val="VerbatimChar"/>
+    <w:rPr>
+      <w:color w:val="4070a0"/>
+    </w:rPr>
+  </w:style>
+  <w:style w:customStyle="1" w:styleId="SpecialStringTok" w:type="character">
+    <w:name w:val="SpecialStringTok"/>
+    <w:basedOn w:val="VerbatimChar"/>
+    <w:rPr>
+      <w:color w:val="bb6688"/>
+    </w:rPr>
+  </w:style>
+  <w:style w:customStyle="1" w:styleId="ImportTok" w:type="character">
+    <w:name w:val="ImportTok"/>
+    <w:basedOn w:val="VerbatimChar"/>
+    <w:rPr>
+      <w:b/>
+      <w:color w:val="008000"/>
+    </w:rPr>
+  </w:style>
+  <w:style w:customStyle="1" w:styleId="CommentTok" w:type="character">
+    <w:name w:val="CommentTok"/>
+    <w:basedOn w:val="VerbatimChar"/>
+    <w:rPr>
+      <w:i/>
+      <w:color w:val="60a0b0"/>
+    </w:rPr>
+  </w:style>
+  <w:style w:customStyle="1" w:styleId="DocumentationTok" w:type="character">
+    <w:name w:val="DocumentationTok"/>
+    <w:basedOn w:val="VerbatimChar"/>
+    <w:rPr>
+      <w:i/>
+      <w:color w:val="ba2121"/>
+    </w:rPr>
+  </w:style>
+  <w:style w:customStyle="1" w:styleId="AnnotationTok" w:type="character">
+    <w:name w:val="AnnotationTok"/>
+    <w:basedOn w:val="VerbatimChar"/>
+    <w:rPr>
+      <w:b/>
+      <w:i/>
+      <w:color w:val="60a0b0"/>
+    </w:rPr>
+  </w:style>
+  <w:style w:customStyle="1" w:styleId="CommentVarTok" w:type="character">
+    <w:name w:val="CommentVarTok"/>
+    <w:basedOn w:val="VerbatimChar"/>
+    <w:rPr>
+      <w:b/>
+      <w:i/>
+      <w:color w:val="60a0b0"/>
+    </w:rPr>
+  </w:style>
+  <w:style w:customStyle="1" w:styleId="OtherTok" w:type="character">
+    <w:name w:val="OtherTok"/>
+    <w:basedOn w:val="VerbatimChar"/>
+    <w:rPr>
+      <w:color w:val="007020"/>
+    </w:rPr>
+  </w:style>
+  <w:style w:customStyle="1" w:styleId="FunctionTok" w:type="character">
+    <w:name w:val="FunctionTok"/>
+    <w:basedOn w:val="VerbatimChar"/>
+    <w:rPr>
+      <w:color w:val="06287e"/>
+    </w:rPr>
+  </w:style>
+  <w:style w:customStyle="1" w:styleId="VariableTok" w:type="character">
+    <w:name w:val="VariableTok"/>
+    <w:basedOn w:val="VerbatimChar"/>
+    <w:rPr>
+      <w:color w:val="19177c"/>
+    </w:rPr>
+  </w:style>
+  <w:style w:customStyle="1" w:styleId="ControlFlowTok" w:type="character">
+    <w:name w:val="ControlFlowTok"/>
+    <w:basedOn w:val="VerbatimChar"/>
+    <w:rPr>
+      <w:b/>
+      <w:color w:val="007020"/>
+    </w:rPr>
+  </w:style>
+  <w:style w:customStyle="1" w:styleId="OperatorTok" w:type="character">
+    <w:name w:val="OperatorTok"/>
+    <w:basedOn w:val="VerbatimChar"/>
+    <w:rPr>
+      <w:color w:val="666666"/>
+    </w:rPr>
+  </w:style>
+  <w:style w:customStyle="1" w:styleId="BuiltInTok" w:type="character">
+    <w:name w:val="BuiltInTok"/>
+    <w:basedOn w:val="VerbatimChar"/>
+    <w:rPr>
+      <w:color w:val="008000"/>
+    </w:rPr>
+  </w:style>
+  <w:style w:customStyle="1" w:styleId="ExtensionTok" w:type="character">
+    <w:name w:val="ExtensionTok"/>
+    <w:basedOn w:val="VerbatimChar"/>
+    <w:rPr/>
+  </w:style>
+  <w:style w:customStyle="1" w:styleId="PreprocessorTok" w:type="character">
+    <w:name w:val="PreprocessorTok"/>
+    <w:basedOn w:val="VerbatimChar"/>
+    <w:rPr>
+      <w:color w:val="bc7a00"/>
+    </w:rPr>
+  </w:style>
+  <w:style w:customStyle="1" w:styleId="AttributeTok" w:type="character">
+    <w:name w:val="AttributeTok"/>
+    <w:basedOn w:val="VerbatimChar"/>
+    <w:rPr>
+      <w:color w:val="7d9029"/>
+    </w:rPr>
+  </w:style>
+  <w:style w:customStyle="1" w:styleId="RegionMarkerTok" w:type="character">
+    <w:name w:val="RegionMarkerTok"/>
+    <w:basedOn w:val="VerbatimChar"/>
+    <w:rPr/>
+  </w:style>
+  <w:style w:customStyle="1" w:styleId="InformationTok" w:type="character">
+    <w:name w:val="InformationTok"/>
+    <w:basedOn w:val="VerbatimChar"/>
+    <w:rPr>
+      <w:b/>
+      <w:i/>
+      <w:color w:val="60a0b0"/>
+    </w:rPr>
+  </w:style>
+  <w:style w:customStyle="1" w:styleId="WarningTok" w:type="character">
+    <w:name w:val="WarningTok"/>
+    <w:basedOn w:val="VerbatimChar"/>
+    <w:rPr>
+      <w:b/>
+      <w:i/>
+      <w:color w:val="60a0b0"/>
+    </w:rPr>
+  </w:style>
+  <w:style w:customStyle="1" w:styleId="AlertTok" w:type="character">
+    <w:name w:val="AlertTok"/>
+    <w:basedOn w:val="VerbatimChar"/>
+    <w:rPr>
+      <w:b/>
+      <w:color w:val="ff0000"/>
+    </w:rPr>
+  </w:style>
+  <w:style w:customStyle="1" w:styleId="ErrorTok" w:type="character">
+    <w:name w:val="ErrorTok"/>
+    <w:basedOn w:val="VerbatimChar"/>
+    <w:rPr>
+      <w:b/>
+      <w:color w:val="ff0000"/>
+    </w:rPr>
+  </w:style>
+  <w:style w:customStyle="1" w:styleId="NormalTok" w:type="character">
+    <w:name w:val="NormalTok"/>
+    <w:basedOn w:val="VerbatimChar"/>
+    <w:rPr/>
+  </w:style>
   <w:style w:type="character" w:customStyle="1" w:styleId="KeywordTok">
     <w:name w:val="KeywordTok"/>
     <w:basedOn w:val="VerbatimChar"/>

</xml_diff>